<commit_message>
Consolidate Paper 2 writing guides into paper2, paper1 and writing_guide
Merge writing.md into paper2.md (was journal_paper.md), fold Paper 1
context into paper1.md (was scientific_expressions.md), rename write.md to
writing_guide.md, restore paper1_paragraphs.json, and save pending
manuscript review changes.

Co-Authored-By: Claude Opus 5.5 (1M context) <noreply@anthropic.com>
</commit_message>
<xml_diff>
--- a/writing/manuscript2.docx
+++ b/writing/manuscript2.docx
@@ -94,250 +94,219 @@
       <w:r>
         <w:t xml:space="preserve">Calibration </w:t>
       </w:r>
+      <w:r>
+        <w:t>for</w:t>
+      </w:r>
+      <w:r>
+        <w:t xml:space="preserve"> Experimental </w:t>
+      </w:r>
+      <w:r>
+        <w:t>implementation</w:t>
+      </w:r>
+      <w:r>
+        <w:t xml:space="preserve"> </w:t>
+      </w:r>
+      <w:r>
+        <w:t>600</w:t>
+      </w:r>
+    </w:p>
+    <w:p>
+      <w:pPr>
+        <w:ind w:left="270" w:hanging="270"/>
+      </w:pPr>
+      <w:r>
+        <w:t xml:space="preserve">4 </w:t>
+      </w:r>
+      <w:r>
+        <w:t>Experimental Verification</w:t>
+      </w:r>
+    </w:p>
+    <w:p>
+      <w:pPr>
+        <w:ind w:left="270"/>
+        <w:rPr>
+          <w:rFonts w:hint="cs"/>
+          <w:rtl/>
+          <w:lang w:bidi="ar-EG"/>
+        </w:rPr>
+      </w:pPr>
+      <w:r>
+        <w:t xml:space="preserve">- </w:t>
+      </w:r>
+      <w:r>
+        <w:t xml:space="preserve">Reference </w:t>
+      </w:r>
+      <w:r>
+        <w:t>Structure</w:t>
+      </w:r>
+      <w:r>
+        <w:t xml:space="preserve"> description</w:t>
+      </w:r>
+      <w:r>
+        <w:t xml:space="preserve"> </w:t>
+      </w:r>
+      <w:r>
+        <w:t>1000</w:t>
+      </w:r>
+      <w:r>
+        <w:br/>
+        <w:t xml:space="preserve">- </w:t>
+      </w:r>
+      <w:r>
+        <w:t>Test Configuration</w:t>
+      </w:r>
+      <w:r>
+        <w:t xml:space="preserve"> </w:t>
+      </w:r>
+      <w:r>
+        <w:t xml:space="preserve">(general numerical substructure, rotational spring, selecting story height) </w:t>
+      </w:r>
+    </w:p>
+    <w:p>
+      <w:pPr>
+        <w:ind w:left="270"/>
+      </w:pPr>
+      <w:r>
+        <w:t>- Pretests</w:t>
+      </w:r>
+    </w:p>
+    <w:p>
+      <w:pPr>
+        <w:ind w:left="720"/>
+      </w:pPr>
+      <w:r>
+        <w:t>-</w:t>
+      </w:r>
+      <w:r>
+        <w:t>-</w:t>
+      </w:r>
+      <w:r>
+        <w:t xml:space="preserve"> </w:t>
+      </w:r>
+      <w:r>
+        <w:t>pre</w:t>
+      </w:r>
+      <w:r>
+        <w:t xml:space="preserve">test </w:t>
+      </w:r>
       <w:proofErr w:type="gramStart"/>
       <w:r>
-        <w:t xml:space="preserve">for </w:t>
-      </w:r>
-      <w:r>
-        <w:t xml:space="preserve"> Experimental</w:t>
+        <w:t>1 :</w:t>
       </w:r>
       <w:proofErr w:type="gramEnd"/>
       <w:r>
         <w:t xml:space="preserve"> </w:t>
       </w:r>
+      <w:r>
+        <w:t xml:space="preserve">system identification </w:t>
+      </w:r>
+      <w:r>
+        <w:t>300   (</w:t>
+      </w:r>
+      <w:r>
+        <w:t xml:space="preserve">not HS </w:t>
+      </w:r>
+      <w:r>
+        <w:t xml:space="preserve">identification </w:t>
+      </w:r>
+      <w:r>
+        <w:br/>
+        <w:t xml:space="preserve">-- pretest 2: damaging for getting the </w:t>
+      </w:r>
       <w:proofErr w:type="spellStart"/>
       <w:r>
-        <w:t>impleemention</w:t>
+        <w:t>hysterises</w:t>
       </w:r>
       <w:proofErr w:type="spellEnd"/>
       <w:r>
+        <w:t xml:space="preserve"> for </w:t>
+      </w:r>
+      <w:proofErr w:type="spellStart"/>
+      <w:r>
+        <w:t>boucwen</w:t>
+      </w:r>
+      <w:proofErr w:type="spellEnd"/>
+      <w:r>
+        <w:t xml:space="preserve"> and also to identify the damaged</w:t>
+      </w:r>
+      <w:r>
+        <w:br/>
+        <w:t xml:space="preserve">-- pretest 3: identification of </w:t>
+      </w:r>
+      <w:proofErr w:type="spellStart"/>
+      <w:r>
+        <w:t>th</w:t>
+      </w:r>
+      <w:proofErr w:type="spellEnd"/>
+      <w:r>
+        <w:t xml:space="preserve"> degraded specimen</w:t>
+      </w:r>
+      <w:r>
+        <w:br/>
+        <w:t>-- discussion</w:t>
+      </w:r>
+    </w:p>
+    <w:p>
+      <w:pPr>
+        <w:ind w:left="270" w:hanging="270"/>
+      </w:pPr>
+      <w:r>
         <w:t xml:space="preserve"> </w:t>
       </w:r>
       <w:r>
-        <w:t>600</w:t>
-      </w:r>
-    </w:p>
-    <w:p>
-      <w:pPr>
-        <w:ind w:left="270" w:hanging="270"/>
-      </w:pPr>
-      <w:r>
-        <w:t xml:space="preserve">4 </w:t>
-      </w:r>
-      <w:r>
-        <w:t>Experimental Verification</w:t>
-      </w:r>
+        <w:tab/>
+        <w:t>- HS test</w:t>
+      </w:r>
+    </w:p>
+    <w:p>
+      <w:pPr>
+        <w:ind w:left="720"/>
+      </w:pPr>
+      <w:r>
+        <w:t>-</w:t>
+      </w:r>
+      <w:r>
+        <w:t xml:space="preserve">- test </w:t>
+      </w:r>
+      <w:proofErr w:type="gramStart"/>
+      <w:r>
+        <w:t>2 :</w:t>
+      </w:r>
+      <w:proofErr w:type="gramEnd"/>
+      <w:r>
+        <w:t xml:space="preserve"> instability observation 300 </w:t>
+      </w:r>
+      <w:r>
+        <w:br/>
+      </w:r>
+      <w:r>
+        <w:t>-</w:t>
+      </w:r>
+      <w:r>
+        <w:t>-</w:t>
+      </w:r>
+      <w:r>
+        <w:t xml:space="preserve"> test 3 : Framework </w:t>
+      </w:r>
+      <w:proofErr w:type="spellStart"/>
+      <w:r>
+        <w:t>vlidation</w:t>
+      </w:r>
+      <w:proofErr w:type="spellEnd"/>
+      <w:r>
+        <w:t xml:space="preserve"> 400  </w:t>
+      </w:r>
+      <w:r>
+        <w:br/>
+        <w:t>-- discussion</w:t>
+      </w:r>
+    </w:p>
+    <w:p>
+      <w:pPr>
+        <w:ind w:left="720"/>
+      </w:pPr>
       <w:bookmarkStart w:id="0" w:name="_GoBack"/>
       <w:bookmarkEnd w:id="0"/>
-    </w:p>
-    <w:p>
-      <w:pPr>
-        <w:ind w:left="270"/>
-      </w:pPr>
-      <w:r>
-        <w:t xml:space="preserve">- </w:t>
-      </w:r>
-      <w:r>
-        <w:t xml:space="preserve">Structure partitioning </w:t>
-      </w:r>
-      <w:r>
-        <w:t>1000</w:t>
-      </w:r>
-      <w:r>
-        <w:br/>
-        <w:t xml:space="preserve">- </w:t>
-      </w:r>
-      <w:r>
-        <w:t>Test Configuration</w:t>
-      </w:r>
-      <w:r>
-        <w:t xml:space="preserve"> </w:t>
-      </w:r>
-      <w:r>
-        <w:t xml:space="preserve">(general numerical substructure, rotational spring, selecting story height) </w:t>
-      </w:r>
-    </w:p>
-    <w:p>
-      <w:pPr>
-        <w:ind w:left="270"/>
-      </w:pPr>
-      <w:r>
-        <w:t>- Pretests</w:t>
-      </w:r>
-    </w:p>
-    <w:p>
-      <w:pPr>
-        <w:ind w:left="720"/>
-      </w:pPr>
-      <w:r>
-        <w:t>-</w:t>
-      </w:r>
-      <w:r>
-        <w:t>-</w:t>
-      </w:r>
-      <w:r>
-        <w:t xml:space="preserve"> </w:t>
-      </w:r>
-      <w:r>
-        <w:t>pre</w:t>
-      </w:r>
-      <w:r>
-        <w:t xml:space="preserve">test </w:t>
-      </w:r>
-      <w:proofErr w:type="gramStart"/>
-      <w:r>
-        <w:t>1 :</w:t>
-      </w:r>
-      <w:proofErr w:type="gramEnd"/>
-      <w:r>
-        <w:t xml:space="preserve"> </w:t>
-      </w:r>
-      <w:r>
-        <w:t xml:space="preserve">system identification </w:t>
-      </w:r>
-      <w:r>
-        <w:t>300</w:t>
-      </w:r>
-      <w:r>
-        <w:t xml:space="preserve">   </w:t>
-      </w:r>
-      <w:r>
-        <w:t>(</w:t>
-      </w:r>
-      <w:r>
-        <w:t xml:space="preserve">not HS </w:t>
-      </w:r>
-      <w:r>
-        <w:t xml:space="preserve">identification </w:t>
-      </w:r>
-      <w:r>
-        <w:br/>
-        <w:t xml:space="preserve">-- pretest 2: damaging for getting the </w:t>
-      </w:r>
-      <w:proofErr w:type="spellStart"/>
-      <w:r>
-        <w:t>hysterises</w:t>
-      </w:r>
-      <w:proofErr w:type="spellEnd"/>
-      <w:r>
-        <w:t xml:space="preserve"> for </w:t>
-      </w:r>
-      <w:proofErr w:type="spellStart"/>
-      <w:r>
-        <w:t>boucwen</w:t>
-      </w:r>
-      <w:proofErr w:type="spellEnd"/>
-      <w:r>
-        <w:t xml:space="preserve"> and also to identify the damaged</w:t>
-      </w:r>
-      <w:r>
-        <w:br/>
-        <w:t xml:space="preserve">-- pretest 3: identification of </w:t>
-      </w:r>
-      <w:proofErr w:type="spellStart"/>
-      <w:r>
-        <w:t>th</w:t>
-      </w:r>
-      <w:proofErr w:type="spellEnd"/>
-      <w:r>
-        <w:t xml:space="preserve"> degraded specimen</w:t>
-      </w:r>
-      <w:r>
-        <w:br/>
-        <w:t>-- discussion</w:t>
-      </w:r>
-    </w:p>
-    <w:p>
-      <w:pPr>
-        <w:ind w:left="270" w:hanging="270"/>
-      </w:pPr>
-      <w:r>
-        <w:t xml:space="preserve"> </w:t>
-      </w:r>
-      <w:r>
-        <w:tab/>
-        <w:t>- HS test</w:t>
-      </w:r>
-    </w:p>
-    <w:p>
-      <w:pPr>
-        <w:ind w:left="720"/>
-      </w:pPr>
-      <w:r>
-        <w:t>-</w:t>
-      </w:r>
-      <w:r>
-        <w:t xml:space="preserve">- test </w:t>
-      </w:r>
-      <w:proofErr w:type="gramStart"/>
-      <w:r>
-        <w:t>2</w:t>
-      </w:r>
-      <w:r>
-        <w:t xml:space="preserve"> :</w:t>
-      </w:r>
-      <w:proofErr w:type="gramEnd"/>
-      <w:r>
-        <w:t xml:space="preserve"> </w:t>
-      </w:r>
-      <w:r>
-        <w:t>instability observation</w:t>
-      </w:r>
-      <w:r>
-        <w:t xml:space="preserve"> </w:t>
-      </w:r>
-      <w:r>
-        <w:t>300</w:t>
-      </w:r>
-      <w:r>
-        <w:t xml:space="preserve"> </w:t>
-      </w:r>
-      <w:r>
-        <w:br/>
-      </w:r>
-      <w:r>
-        <w:t>-</w:t>
-      </w:r>
-      <w:r>
-        <w:t>-</w:t>
-      </w:r>
-      <w:r>
-        <w:t xml:space="preserve"> test </w:t>
-      </w:r>
-      <w:r>
-        <w:t>3</w:t>
-      </w:r>
-      <w:r>
-        <w:t xml:space="preserve"> : </w:t>
-      </w:r>
-      <w:r>
-        <w:t xml:space="preserve">Framework </w:t>
-      </w:r>
-      <w:proofErr w:type="spellStart"/>
-      <w:r>
-        <w:t>vlidation</w:t>
-      </w:r>
-      <w:proofErr w:type="spellEnd"/>
-      <w:r>
-        <w:t xml:space="preserve"> </w:t>
-      </w:r>
-      <w:r>
-        <w:t>400</w:t>
-      </w:r>
-      <w:r>
-        <w:t xml:space="preserve">  </w:t>
-      </w:r>
-      <w:r>
-        <w:br/>
-      </w:r>
-      <w:r>
-        <w:t>-- discussion</w:t>
-      </w:r>
-    </w:p>
-    <w:p>
-      <w:pPr>
-        <w:ind w:left="720"/>
-      </w:pPr>
     </w:p>
     <w:p>
       <w:pPr>

</xml_diff>